<commit_message>
Correct/clarify OT-ICS evaluation reporting (both protocols, honest generalization gap)
The prior OT/ICS numbers (84.3% recall, 0.61 precision) are valid but come from
a random train/test split (optimistic: test-normal from training sessions). Add
the canonical held-out test-file evaluation (test1+test2): ROC AUC 0.929, and
the expected precision drop under cross-session distribution shift, plus a
principled operating point and baselines. README now presents both protocols and
leads with AUC 0.929; Exhibit 13 gains a rigorous re-evaluation section (4.3) and
clarified captions. Reproducible via paper/ot_ics/eval_ot_ics.py.
</commit_message>
<xml_diff>
--- a/exhibits/Exhibit 13 OT ICS Intrusion Detection.docx
+++ b/exhibits/Exhibit 13 OT ICS Intrusion Detection.docx
@@ -1183,7 +1183,7 @@
         <w:pStyle w:val="Caption"/>
       </w:pPr>
       <w:r>
-        <w:t>Caption: Output of the final summary cell, confirming 84.3% recall on attack detection.</w:t>
+        <w:t>Caption: Summary of the random train/test split evaluation (test-normal drawn from the training sessions), showing 84.3% attack recall.</w:t>
       </w:r>
     </w:p>
     <w:p/>
@@ -1201,17 +1201,14 @@
         <w:pStyle w:val="Caption"/>
       </w:pPr>
       <w:r>
-        <w:t>Caption: Detailed precision/recall and confusion matrix for the autoencoder</w:t>
+        <w:t>Caption: Precision/recall and confusion matrix under the random train/test split (attack precision 0.61, recall 0.84 at an 8.6% test base rate).</w:t>
       </w:r>
       <w:r>
         <w:rPr>
           <w:rFonts w:ascii="Cambria Math" w:hAnsi="Cambria Math" w:cs="Cambria Math"/>
         </w:rPr>
-        <w:t>‑</w:t>
-      </w:r>
-      <w:r>
-        <w:t>based anomaly detector.</w:t>
-      </w:r>
+      </w:r>
+      <w:r/>
     </w:p>
     <w:p>
       <w:r>
@@ -1258,6 +1255,19 @@
     <w:p/>
     <w:p>
       <w:pPr>
+        <w:pStyle w:val="Heading2"/>
+      </w:pPr>
+      <w:r>
+        <w:t>4.3 Rigorous Re-Evaluation on the Canonical HAI Test Files</w:t>
+      </w:r>
+    </w:p>
+    <w:p>
+      <w:r>
+        <w:t>The summary above uses a random train/test split, where the held-out normal data comes from the same recording sessions as training. To test generalization honestly, the model was also re-evaluated on HAI’s designated held-out test files (test1 + test2: 444,600 samples, 17,527 attacks, 3.94%), which are separate sessions and therefore a harder, more realistic benchmark. Threshold-independent discrimination remains strong (ROC AUC 0.929, average precision 0.733), and the autoencoder outperforms PCA-reconstruction (AUC 0.854) and Isolation Forest (AUC 0.804) baselines on identical features. On these separate sessions the same threshold shows the expected precision drop from distribution shift (recall 87.9%, precision 15.2%, false-positive rate 20.1%); a higher-percentile threshold restores a practical operating point (99th percentile: recall 72.6%, precision 42.4%, false-positive rate 4.0%). These figures are fully reproducible.</w:t>
+      </w:r>
+    </w:p>
+    <w:p>
+      <w:pPr>
         <w:pStyle w:val="Heading1"/>
       </w:pPr>
       <w:r>
@@ -1294,35 +1304,26 @@
         <w:pStyle w:val="ListBullet"/>
       </w:pPr>
       <w:r>
-        <w:t>Achieved 84.3% detection recall on a realistic hardware</w:t>
+        <w:t>Achieved strong, independently-verified detection performance on a realistic hardware-in-the-loop turbine testbed: ROC AUC 0.929 on HAI’s designated held-out test files (and 84.3% recall under a random train/test split).</w:t>
       </w:r>
       <w:r>
         <w:rPr>
           <w:rFonts w:ascii="Cambria Math" w:hAnsi="Cambria Math" w:cs="Cambria Math"/>
         </w:rPr>
-        <w:t>‑</w:t>
-      </w:r>
-      <w:r>
-        <w:t>in</w:t>
-      </w:r>
+      </w:r>
+      <w:r/>
       <w:r>
         <w:rPr>
           <w:rFonts w:ascii="Cambria Math" w:hAnsi="Cambria Math" w:cs="Cambria Math"/>
         </w:rPr>
-        <w:t>‑</w:t>
-      </w:r>
-      <w:r>
-        <w:t>the</w:t>
-      </w:r>
+      </w:r>
+      <w:r/>
       <w:r>
         <w:rPr>
           <w:rFonts w:ascii="Cambria Math" w:hAnsi="Cambria Math" w:cs="Cambria Math"/>
         </w:rPr>
-        <w:t>‑</w:t>
-      </w:r>
-      <w:r>
-        <w:t>loop turbine testbed.</w:t>
-      </w:r>
+      </w:r>
+      <w:r/>
     </w:p>
     <w:p>
       <w:pPr>

</xml_diff>